<commit_message>
Infer grouped DOCX flow diagrams in canonical output
</commit_message>
<xml_diff>
--- a/src/test/resources/ooxml/v2-diagrams.docx
+++ b/src/test/resources/ooxml/v2-diagrams.docx
@@ -12,7 +12,7 @@
         <w:rPr>
           <w:rFonts w:ascii="ING Me" w:hAnsi="ING Me" w:cs="Arial"/>
         </w:rPr>
-        <w:t>Title 1</w:t>
+        <w:t>Image78.emf</w:t>
       </w:r>
     </w:p>
     <w:p>
@@ -26,9 +26,9 @@
           <w:noProof/>
         </w:rPr>
         <w:drawing>
-          <wp:inline distT="0" distB="0" distL="0" distR="0" wp14:anchorId="0C114769" wp14:editId="0DED48C9">
-            <wp:extent cx="1865630" cy="3131185"/>
-            <wp:effectExtent l="0" t="0" r="1270" b="0"/>
+          <wp:inline distT="0" distB="0" distL="0" distR="0" wp14:anchorId="0C114769" wp14:editId="15038557">
+            <wp:extent cx="2029597" cy="3406379"/>
+            <wp:effectExtent l="0" t="0" r="2540" b="0"/>
             <wp:docPr id="469179847" name="Picture 5"/>
             <wp:cNvGraphicFramePr>
               <a:graphicFrameLocks xmlns:a="http://schemas.openxmlformats.org/drawingml/2006/main" noChangeAspect="1"/>
@@ -58,7 +58,7 @@
                   <pic:spPr bwMode="auto">
                     <a:xfrm>
                       <a:off x="0" y="0"/>
-                      <a:ext cx="1865630" cy="3131185"/>
+                      <a:ext cx="2053696" cy="3446826"/>
                     </a:xfrm>
                     <a:prstGeom prst="rect">
                       <a:avLst/>
@@ -86,28 +86,27 @@
           <w:rFonts w:ascii="ING Me" w:hAnsi="ING Me"/>
         </w:rPr>
         <w:br/>
-        <w:t>Title 2</w:t>
       </w:r>
       <w:r>
         <w:rPr>
           <w:rFonts w:ascii="ING Me" w:hAnsi="ING Me"/>
+        </w:rPr>
+        <w:t>image81.emf</w:t>
+      </w:r>
+      <w:r>
+        <w:rPr>
+          <w:rFonts w:ascii="ING Me" w:hAnsi="ING Me" w:cs="Arial"/>
         </w:rPr>
         <w:br/>
       </w:r>
       <w:r>
         <w:rPr>
-          <w:rFonts w:ascii="ING Me" w:hAnsi="ING Me" w:cs="Arial"/>
-        </w:rPr>
-        <w:br/>
-      </w:r>
-      <w:r>
-        <w:rPr>
           <w:noProof/>
         </w:rPr>
         <w:drawing>
-          <wp:inline distT="0" distB="0" distL="0" distR="0" wp14:anchorId="7593E324" wp14:editId="448347C9">
-            <wp:extent cx="5731510" cy="1660232"/>
-            <wp:effectExtent l="0" t="0" r="0" b="3810"/>
+          <wp:inline distT="0" distB="0" distL="0" distR="0" wp14:anchorId="7593E324" wp14:editId="1BE37598">
+            <wp:extent cx="6326659" cy="1832627"/>
+            <wp:effectExtent l="0" t="0" r="0" b="0"/>
             <wp:docPr id="25" name="Picture 25"/>
             <wp:cNvGraphicFramePr>
               <a:graphicFrameLocks xmlns:a="http://schemas.openxmlformats.org/drawingml/2006/main" noChangeAspect="1"/>
@@ -137,7 +136,7 @@
                   <pic:spPr bwMode="auto">
                     <a:xfrm>
                       <a:off x="0" y="0"/>
-                      <a:ext cx="5731510" cy="1660232"/>
+                      <a:ext cx="6513804" cy="1886837"/>
                     </a:xfrm>
                     <a:prstGeom prst="rect">
                       <a:avLst/>

</xml_diff>

<commit_message>
further improved diagram recognition
</commit_message>
<xml_diff>
--- a/src/test/resources/ooxml/v2-diagrams.docx
+++ b/src/test/resources/ooxml/v2-diagrams.docx
@@ -1,6 +1,6 @@
 
 <file path=word/document.xml><?xml version="1.0" encoding="utf-8"?>
-<w:document xmlns:wpc="http://schemas.microsoft.com/office/word/2010/wordprocessingCanvas" xmlns:cx="http://schemas.microsoft.com/office/drawing/2014/chartex" xmlns:cx1="http://schemas.microsoft.com/office/drawing/2015/9/8/chartex" xmlns:cx2="http://schemas.microsoft.com/office/drawing/2015/10/21/chartex" xmlns:cx3="http://schemas.microsoft.com/office/drawing/2016/5/9/chartex" xmlns:cx4="http://schemas.microsoft.com/office/drawing/2016/5/10/chartex" xmlns:cx5="http://schemas.microsoft.com/office/drawing/2016/5/11/chartex" xmlns:cx6="http://schemas.microsoft.com/office/drawing/2016/5/12/chartex" xmlns:cx7="http://schemas.microsoft.com/office/drawing/2016/5/13/chartex" xmlns:cx8="http://schemas.microsoft.com/office/drawing/2016/5/14/chartex" xmlns:mc="http://schemas.openxmlformats.org/markup-compatibility/2006" xmlns:m="http://schemas.openxmlformats.org/officeDocument/2006/math" xmlns:aink="http://schemas.microsoft.com/office/drawing/2016/ink" xmlns:am3d="http://schemas.microsoft.com/office/drawing/2017/model3d" xmlns:oel="http://schemas.microsoft.com/office/2019/extlst" xmlns:r="http://schemas.openxmlformats.org/officeDocument/2006/relationships" xmlns:wp14="http://schemas.microsoft.com/office/word/2010/wordprocessingDrawing" xmlns:wp="http://schemas.openxmlformats.org/drawingml/2006/wordprocessingDrawing" xmlns:wpg="http://schemas.microsoft.com/office/word/2010/wordprocessingGroup" xmlns:wpi="http://schemas.microsoft.com/office/word/2010/wordprocessingInk" xmlns:wps="http://schemas.microsoft.com/office/word/2010/wordprocessingShape" xmlns:o="urn:schemas-microsoft-com:office:office" xmlns:v="urn:schemas-microsoft-com:vml" xmlns:w10="urn:schemas-microsoft-com:office:word" xmlns:w="http://schemas.openxmlformats.org/wordprocessingml/2006/main" xmlns:w14="http://schemas.microsoft.com/office/word/2010/wordml" xmlns:w15="http://schemas.microsoft.com/office/word/2012/wordml" xmlns:w16cei="http://schemas.microsoft.com/office/word/2026/wordml/cei" xmlns:w16cex="http://schemas.microsoft.com/office/word/2018/wordml/cex" xmlns:w16cid="http://schemas.microsoft.com/office/word/2016/wordml/cid" xmlns:w16="http://schemas.microsoft.com/office/word/2018/wordml" xmlns:w16sdtdh="http://schemas.microsoft.com/office/word/2020/wordml/sdtdatahash" xmlns:w16sdtfl="http://schemas.microsoft.com/office/word/2024/wordml/sdtformatlock" xmlns:w16se="http://schemas.microsoft.com/office/word/2015/wordml/symex" xmlns:w16du="http://schemas.microsoft.com/office/word/2023/wordml/word16du" xmlns:wne="http://schemas.microsoft.com/office/word/2006/wordml" mc:Ignorable="w14 w15 w16se w16cid w16 w16cex w16sdtdh w16sdtfl w16du wp14">
+<w:document xmlns:wpc="http://schemas.microsoft.com/office/word/2010/wordprocessingCanvas" xmlns:cx="http://schemas.microsoft.com/office/drawing/2014/chartex" xmlns:cx1="http://schemas.microsoft.com/office/drawing/2015/9/8/chartex" xmlns:cx2="http://schemas.microsoft.com/office/drawing/2015/10/21/chartex" xmlns:cx3="http://schemas.microsoft.com/office/drawing/2016/5/9/chartex" xmlns:cx4="http://schemas.microsoft.com/office/drawing/2016/5/10/chartex" xmlns:cx5="http://schemas.microsoft.com/office/drawing/2016/5/11/chartex" xmlns:cx6="http://schemas.microsoft.com/office/drawing/2016/5/12/chartex" xmlns:cx7="http://schemas.microsoft.com/office/drawing/2016/5/13/chartex" xmlns:cx8="http://schemas.microsoft.com/office/drawing/2016/5/14/chartex" xmlns:mc="http://schemas.openxmlformats.org/markup-compatibility/2006" xmlns:m="http://schemas.openxmlformats.org/officeDocument/2006/math" xmlns:aink="http://schemas.microsoft.com/office/drawing/2016/ink" xmlns:am3d="http://schemas.microsoft.com/office/drawing/2017/model3d" xmlns:oel="http://schemas.microsoft.com/office/2019/extlst" xmlns:r="http://schemas.openxmlformats.org/officeDocument/2006/relationships" xmlns:wp14="http://schemas.microsoft.com/office/word/2010/wordprocessingDrawing" xmlns:wp="http://schemas.openxmlformats.org/drawingml/2006/wordprocessingDrawing" xmlns:wpg="http://schemas.microsoft.com/office/word/2010/wordprocessingGroup" xmlns:wpi="http://schemas.microsoft.com/office/word/2010/wordprocessingInk" xmlns:wps="http://schemas.microsoft.com/office/word/2010/wordprocessingShape" xmlns:o="urn:schemas-microsoft-com:office:office" xmlns:v="urn:schemas-microsoft-com:vml" xmlns:w10="urn:schemas-microsoft-com:office:word" xmlns:w="http://schemas.openxmlformats.org/wordprocessingml/2006/main" xmlns:w14="http://schemas.microsoft.com/office/word/2010/wordml" xmlns:w15="http://schemas.microsoft.com/office/word/2012/wordml" xmlns:w16cex="http://schemas.microsoft.com/office/word/2018/wordml/cex" xmlns:w16cid="http://schemas.microsoft.com/office/word/2016/wordml/cid" xmlns:w16="http://schemas.microsoft.com/office/word/2018/wordml" xmlns:w16sdtdh="http://schemas.microsoft.com/office/word/2020/wordml/sdtdatahash" xmlns:w16sdtfl="http://schemas.microsoft.com/office/word/2024/wordml/sdtformatlock" xmlns:w16se="http://schemas.microsoft.com/office/word/2015/wordml/symex" xmlns:w16du="http://schemas.microsoft.com/office/word/2023/wordml/word16du" xmlns:wne="http://schemas.microsoft.com/office/word/2006/wordml" mc:Ignorable="w14 w15 w16se w16cid w16 w16cex w16sdtdh w16sdtfl w16du wp14">
   <w:body>
     <w:p>
       <w:pPr>
@@ -153,7 +153,79 @@
         </w:drawing>
       </w:r>
     </w:p>
-    <w:p/>
+    <w:p>
+      <w:pPr>
+        <w:spacing w:line="240" w:lineRule="auto"/>
+      </w:pPr>
+      <w:r>
+        <w:br w:type="page"/>
+      </w:r>
+    </w:p>
+    <w:p>
+      <w:r>
+        <w:lastRenderedPageBreak/>
+        <w:t>flow chart</w:t>
+      </w:r>
+      <w:r>
+        <w:rPr>
+          <w:noProof/>
+        </w:rPr>
+        <w:br/>
+      </w:r>
+      <w:r>
+        <w:rPr>
+          <w:noProof/>
+        </w:rPr>
+        <w:drawing>
+          <wp:inline distT="0" distB="0" distL="0" distR="0" wp14:anchorId="5CA06100" wp14:editId="53F47DE4">
+            <wp:extent cx="5731510" cy="3456757"/>
+            <wp:effectExtent l="0" t="0" r="0" b="0"/>
+            <wp:docPr id="200" name="Picture 200"/>
+            <wp:cNvGraphicFramePr>
+              <a:graphicFrameLocks xmlns:a="http://schemas.openxmlformats.org/drawingml/2006/main" noChangeAspect="1"/>
+            </wp:cNvGraphicFramePr>
+            <a:graphic xmlns:a="http://schemas.openxmlformats.org/drawingml/2006/main">
+              <a:graphicData uri="http://schemas.openxmlformats.org/drawingml/2006/picture">
+                <pic:pic xmlns:pic="http://schemas.openxmlformats.org/drawingml/2006/picture">
+                  <pic:nvPicPr>
+                    <pic:cNvPr id="0" name="Picture 19"/>
+                    <pic:cNvPicPr>
+                      <a:picLocks noChangeAspect="1" noChangeArrowheads="1"/>
+                    </pic:cNvPicPr>
+                  </pic:nvPicPr>
+                  <pic:blipFill>
+                    <a:blip r:embed="rId7">
+                      <a:extLst>
+                        <a:ext uri="{28A0092B-C50C-407E-A947-70E740481C1C}">
+                          <a14:useLocalDpi xmlns:a14="http://schemas.microsoft.com/office/drawing/2010/main" val="0"/>
+                        </a:ext>
+                      </a:extLst>
+                    </a:blip>
+                    <a:srcRect/>
+                    <a:stretch>
+                      <a:fillRect/>
+                    </a:stretch>
+                  </pic:blipFill>
+                  <pic:spPr bwMode="auto">
+                    <a:xfrm>
+                      <a:off x="0" y="0"/>
+                      <a:ext cx="5731510" cy="3456757"/>
+                    </a:xfrm>
+                    <a:prstGeom prst="rect">
+                      <a:avLst/>
+                    </a:prstGeom>
+                    <a:noFill/>
+                    <a:ln>
+                      <a:noFill/>
+                    </a:ln>
+                  </pic:spPr>
+                </pic:pic>
+              </a:graphicData>
+            </a:graphic>
+          </wp:inline>
+        </w:drawing>
+      </w:r>
+    </w:p>
     <w:sectPr>
       <w:pgSz w:w="11906" w:h="16838"/>
       <w:pgMar w:top="1440" w:right="1440" w:bottom="1440" w:left="1440" w:header="708" w:footer="708" w:gutter="0"/>
@@ -165,7 +237,7 @@
 </file>
 
 <file path=word/numbering.xml><?xml version="1.0" encoding="utf-8"?>
-<w:numbering xmlns:wpc="http://schemas.microsoft.com/office/word/2010/wordprocessingCanvas" xmlns:cx="http://schemas.microsoft.com/office/drawing/2014/chartex" xmlns:cx1="http://schemas.microsoft.com/office/drawing/2015/9/8/chartex" xmlns:cx2="http://schemas.microsoft.com/office/drawing/2015/10/21/chartex" xmlns:cx3="http://schemas.microsoft.com/office/drawing/2016/5/9/chartex" xmlns:cx4="http://schemas.microsoft.com/office/drawing/2016/5/10/chartex" xmlns:cx5="http://schemas.microsoft.com/office/drawing/2016/5/11/chartex" xmlns:cx6="http://schemas.microsoft.com/office/drawing/2016/5/12/chartex" xmlns:cx7="http://schemas.microsoft.com/office/drawing/2016/5/13/chartex" xmlns:cx8="http://schemas.microsoft.com/office/drawing/2016/5/14/chartex" xmlns:mc="http://schemas.openxmlformats.org/markup-compatibility/2006" xmlns:m="http://schemas.openxmlformats.org/officeDocument/2006/math" xmlns:aink="http://schemas.microsoft.com/office/drawing/2016/ink" xmlns:am3d="http://schemas.microsoft.com/office/drawing/2017/model3d" xmlns:oel="http://schemas.microsoft.com/office/2019/extlst" xmlns:r="http://schemas.openxmlformats.org/officeDocument/2006/relationships" xmlns:wp14="http://schemas.microsoft.com/office/word/2010/wordprocessingDrawing" xmlns:wp="http://schemas.openxmlformats.org/drawingml/2006/wordprocessingDrawing" xmlns:wpg="http://schemas.microsoft.com/office/word/2010/wordprocessingGroup" xmlns:wpi="http://schemas.microsoft.com/office/word/2010/wordprocessingInk" xmlns:wps="http://schemas.microsoft.com/office/word/2010/wordprocessingShape" xmlns:o="urn:schemas-microsoft-com:office:office" xmlns:v="urn:schemas-microsoft-com:vml" xmlns:w10="urn:schemas-microsoft-com:office:word" xmlns:w="http://schemas.openxmlformats.org/wordprocessingml/2006/main" xmlns:w14="http://schemas.microsoft.com/office/word/2010/wordml" xmlns:w15="http://schemas.microsoft.com/office/word/2012/wordml" xmlns:w16cei="http://schemas.microsoft.com/office/word/2026/wordml/cei" xmlns:w16cex="http://schemas.microsoft.com/office/word/2018/wordml/cex" xmlns:w16cid="http://schemas.microsoft.com/office/word/2016/wordml/cid" xmlns:w16="http://schemas.microsoft.com/office/word/2018/wordml" xmlns:w16sdtdh="http://schemas.microsoft.com/office/word/2020/wordml/sdtdatahash" xmlns:w16sdtfl="http://schemas.microsoft.com/office/word/2024/wordml/sdtformatlock" xmlns:w16se="http://schemas.microsoft.com/office/word/2015/wordml/symex" xmlns:w16du="http://schemas.microsoft.com/office/word/2023/wordml/word16du" xmlns:wne="http://schemas.microsoft.com/office/word/2006/wordml" mc:Ignorable="w14 w15 w16se w16cid w16 w16cex w16sdtdh w16sdtfl w16du wp14">
+<w:numbering xmlns:wpc="http://schemas.microsoft.com/office/word/2010/wordprocessingCanvas" xmlns:cx="http://schemas.microsoft.com/office/drawing/2014/chartex" xmlns:cx1="http://schemas.microsoft.com/office/drawing/2015/9/8/chartex" xmlns:cx2="http://schemas.microsoft.com/office/drawing/2015/10/21/chartex" xmlns:cx3="http://schemas.microsoft.com/office/drawing/2016/5/9/chartex" xmlns:cx4="http://schemas.microsoft.com/office/drawing/2016/5/10/chartex" xmlns:cx5="http://schemas.microsoft.com/office/drawing/2016/5/11/chartex" xmlns:cx6="http://schemas.microsoft.com/office/drawing/2016/5/12/chartex" xmlns:cx7="http://schemas.microsoft.com/office/drawing/2016/5/13/chartex" xmlns:cx8="http://schemas.microsoft.com/office/drawing/2016/5/14/chartex" xmlns:mc="http://schemas.openxmlformats.org/markup-compatibility/2006" xmlns:m="http://schemas.openxmlformats.org/officeDocument/2006/math" xmlns:aink="http://schemas.microsoft.com/office/drawing/2016/ink" xmlns:am3d="http://schemas.microsoft.com/office/drawing/2017/model3d" xmlns:oel="http://schemas.microsoft.com/office/2019/extlst" xmlns:r="http://schemas.openxmlformats.org/officeDocument/2006/relationships" xmlns:wp14="http://schemas.microsoft.com/office/word/2010/wordprocessingDrawing" xmlns:wp="http://schemas.openxmlformats.org/drawingml/2006/wordprocessingDrawing" xmlns:wpg="http://schemas.microsoft.com/office/word/2010/wordprocessingGroup" xmlns:wpi="http://schemas.microsoft.com/office/word/2010/wordprocessingInk" xmlns:wps="http://schemas.microsoft.com/office/word/2010/wordprocessingShape" xmlns:o="urn:schemas-microsoft-com:office:office" xmlns:v="urn:schemas-microsoft-com:vml" xmlns:w10="urn:schemas-microsoft-com:office:word" xmlns:w="http://schemas.openxmlformats.org/wordprocessingml/2006/main" xmlns:w14="http://schemas.microsoft.com/office/word/2010/wordml" xmlns:w15="http://schemas.microsoft.com/office/word/2012/wordml" xmlns:w16cex="http://schemas.microsoft.com/office/word/2018/wordml/cex" xmlns:w16cid="http://schemas.microsoft.com/office/word/2016/wordml/cid" xmlns:w16="http://schemas.microsoft.com/office/word/2018/wordml" xmlns:w16sdtdh="http://schemas.microsoft.com/office/word/2020/wordml/sdtdatahash" xmlns:w16sdtfl="http://schemas.microsoft.com/office/word/2024/wordml/sdtformatlock" xmlns:w16se="http://schemas.microsoft.com/office/word/2015/wordml/symex" xmlns:w16du="http://schemas.microsoft.com/office/word/2023/wordml/word16du" xmlns:wne="http://schemas.microsoft.com/office/word/2006/wordml" mc:Ignorable="w14 w15 w16se w16cid w16 w16cex w16sdtdh w16sdtfl w16du wp14">
   <w:abstractNum w:abstractNumId="0" w15:restartNumberingAfterBreak="0">
     <w:nsid w:val="0D9969DC"/>
     <w:multiLevelType w:val="multilevel"/>
@@ -1088,6 +1160,7 @@
   </w:style>
   <w:style w:type="character" w:customStyle="1" w:styleId="Heading1Char">
     <w:name w:val="Heading 1 Char"/>
+    <w:aliases w:val="H1 ING Chapter Char,Manual_Heading 1 Char"/>
     <w:basedOn w:val="DefaultParagraphFont"/>
     <w:link w:val="Heading1"/>
     <w:uiPriority w:val="9"/>
@@ -1102,6 +1175,7 @@
   </w:style>
   <w:style w:type="character" w:customStyle="1" w:styleId="Heading2Char">
     <w:name w:val="Heading 2 Char"/>
+    <w:aliases w:val="H2 ING Sub Chapter Char,Manual_Heading 2 Char"/>
     <w:basedOn w:val="DefaultParagraphFont"/>
     <w:link w:val="Heading2"/>
     <w:uiPriority w:val="9"/>
@@ -1117,6 +1191,7 @@
   </w:style>
   <w:style w:type="character" w:customStyle="1" w:styleId="Heading3Char">
     <w:name w:val="Heading 3 Char"/>
+    <w:aliases w:val="H3 ING Paragraph Char,Manual_Heading 3 Char"/>
     <w:basedOn w:val="DefaultParagraphFont"/>
     <w:link w:val="Heading3"/>
     <w:uiPriority w:val="9"/>
@@ -1132,6 +1207,7 @@
   </w:style>
   <w:style w:type="character" w:customStyle="1" w:styleId="Heading4Char">
     <w:name w:val="Heading 4 Char"/>
+    <w:aliases w:val="H4 ING Sub Paragraph Char"/>
     <w:basedOn w:val="DefaultParagraphFont"/>
     <w:link w:val="Heading4"/>
     <w:uiPriority w:val="9"/>
@@ -1147,6 +1223,7 @@
   </w:style>
   <w:style w:type="character" w:customStyle="1" w:styleId="Heading5Char">
     <w:name w:val="Heading 5 Char"/>
+    <w:aliases w:val="H5 ING Sub Sub Paragraph Char"/>
     <w:basedOn w:val="DefaultParagraphFont"/>
     <w:link w:val="Heading5"/>
     <w:uiPriority w:val="9"/>
@@ -1174,6 +1251,7 @@
   </w:style>
   <w:style w:type="character" w:customStyle="1" w:styleId="Heading7Char">
     <w:name w:val="Heading 7 Char"/>
+    <w:aliases w:val="H7 Preface Char"/>
     <w:basedOn w:val="DefaultParagraphFont"/>
     <w:link w:val="Heading7"/>
     <w:uiPriority w:val="9"/>
@@ -1187,6 +1265,7 @@
   </w:style>
   <w:style w:type="character" w:customStyle="1" w:styleId="Heading8Char">
     <w:name w:val="Heading 8 Char"/>
+    <w:aliases w:val="H8 Glossary Char,Heading 8 (Start Appendices) Char"/>
     <w:basedOn w:val="DefaultParagraphFont"/>
     <w:link w:val="Heading8"/>
     <w:uiPriority w:val="9"/>
@@ -1202,6 +1281,7 @@
   </w:style>
   <w:style w:type="character" w:customStyle="1" w:styleId="Heading9Char">
     <w:name w:val="Heading 9 Char"/>
+    <w:aliases w:val="H9 Appendix Char,Appendix Char,Appendix + Justified Char"/>
     <w:basedOn w:val="DefaultParagraphFont"/>
     <w:link w:val="Heading9"/>
     <w:uiPriority w:val="9"/>

</xml_diff>